<commit_message>
Polish Seed Cup task wording
</commit_message>
<xml_diff>
--- a/docs/seed-cup-embedded-dual-adc-task.docx
+++ b/docs/seed-cup-embedded-dual-adc-task.docx
@@ -115,7 +115,7 @@
           <w:color w:val="000000"/>
           <w:sz w:val="22"/>
         </w:rPr>
-        <w:t>在工业控制、环境监测和电池管理设备中，单片机通常需要同时读取多个模拟量，并通过显示屏和串口向操作人员提供结果。本题要求选手在 AliceSIM 中完成一个双路模拟量采集终端：两个模拟源分别接入 STM32F103C8T6 的 PA0 和 PB0，OLED 显示换算后的电压，USART2 输出同一份数据；运行开关和双色状态灯用于表示设备是否处于采集状态。</w:t>
+        <w:t>工业控制、环境监测和电池管理设备经常要同时读取多路模拟量，再把结果送到显示屏和串口。本题在 AliceSIM 中搭建一个双路模拟量采集终端：两个模拟源接入 STM32F103C8T6 的 PA0、PB0，OLED 显示换算后的电压，USART2 输出同样的数据，运行开关和双色状态灯表示设备当前是否在采集。</w:t>
       </w:r>
     </w:p>
     <w:p>
@@ -128,7 +128,7 @@
           <w:color w:val="000000"/>
           <w:sz w:val="22"/>
         </w:rPr>
-        <w:t>本题考查 STM32 HAL 外设初始化、ADC 采样与量程换算、I²C 显示、串口格式化、GPIO 输入输出和基本控制逻辑。所有输入均由仿真电路提供，禁止使用固定数值冒充采样结果。</w:t>
+        <w:t>考核范围包括 STM32 HAL 外设初始化、ADC 采样与量程换算、I²C 显示、串口格式化、GPIO 输入输出和基本控制逻辑。输入全部来自仿真电路，固定数值不能代替真实采样。</w:t>
       </w:r>
     </w:p>
     <w:p>
@@ -201,7 +201,7 @@
           <w:color w:val="000000"/>
           <w:sz w:val="22"/>
         </w:rPr>
-        <w:t xml:space="preserve">导入工程后，使用 AliceSIM 的“构建”和“仿真”页面完成验证。仓库中的 </w:t>
+        <w:t xml:space="preserve">工程导入后，在 AliceSIM 的“构建”和“仿真”页面完成验证。仓库中的 </w:t>
       </w:r>
       <w:r>
         <w:rPr>
@@ -217,7 +217,7 @@
           <w:color w:val="000000"/>
           <w:sz w:val="22"/>
         </w:rPr>
-        <w:t xml:space="preserve"> 是出题方参考实现；正式发放选手包时，可以将应用区替换为待完成的起始代码，但必须保留同一 IOC 配置和电路连接。</w:t>
+        <w:t xml:space="preserve"> 保留了出题方参考实现。正式发放选手包时，可以将应用区改成待完成的起始代码，IOC 配置和电路连接保持不变。</w:t>
       </w:r>
     </w:p>
     <w:p>
@@ -1263,7 +1263,7 @@
           <w:color w:val="000000"/>
           <w:sz w:val="22"/>
         </w:rPr>
-        <w:t>双色灯不是两个 GPIO：PB12 输出高电平时绿灯支路导通、红灯熄灭；PB12 输出低电平时红灯支路导通、绿灯熄灭。电路中的两个 330 Ω 电阻用于限流。</w:t>
+        <w:t>双色灯共用 PB12。PB12 输出高电平时绿灯支路导通、红灯熄灭；输出低电平时红灯支路导通、绿灯熄灭。两条支路各串联一个 330 Ω 电阻限流。</w:t>
       </w:r>
     </w:p>
     <w:p>
@@ -1292,7 +1292,7 @@
           <w:color w:val="000000"/>
           <w:sz w:val="22"/>
         </w:rPr>
-        <w:t xml:space="preserve">完成 </w:t>
+        <w:t xml:space="preserve">初始化阶段完成 </w:t>
       </w:r>
       <w:r>
         <w:rPr>
@@ -1308,7 +1308,7 @@
           <w:color w:val="000000"/>
           <w:sz w:val="22"/>
         </w:rPr>
-        <w:t>、时钟和 IOC 中已配置外设的初始化。应用代码至少应正确初始化 ADC1、ADC2、I2C1、USART2 和 GPIO。OLED 初始化失败时不得继续报告“采集正常”。</w:t>
+        <w:t>、时钟以及 IOC 中已配置外设的初始化。应用代码应正确初始化 ADC1、ADC2、I2C1、USART2 和 GPIO。OLED 初始化失败时，不得继续报告“采集正常”。</w:t>
       </w:r>
     </w:p>
     <w:p>
@@ -1329,7 +1329,7 @@
           <w:color w:val="000000"/>
           <w:sz w:val="22"/>
         </w:rPr>
-        <w:t>程序循环读取 PA1：</w:t>
+        <w:t>循环读取 PA1，按电平切换状态：</w:t>
       </w:r>
     </w:p>
     <w:p>
@@ -1423,7 +1423,7 @@
           <w:color w:val="000000"/>
           <w:sz w:val="22"/>
         </w:rPr>
-        <w:t>采集态下分别读取 PA0 和 PB0 的 ADC 值，建议周期为 100 ms。STM32F1 的 ADC 分辨率为 12 bit，参考电压为 3.3 V，换算关系为：</w:t>
+        <w:t>进入采集态后，分别读取 PA0 和 PB0 的 ADC 值，周期约为 100 ms。STM32F1 的 ADC 分辨率为 12 bit，参考电压为 3.3 V，换算关系为：</w:t>
       </w:r>
     </w:p>
     <w:p>
@@ -1449,7 +1449,7 @@
           <w:color w:val="000000"/>
           <w:sz w:val="22"/>
         </w:rPr>
-        <w:t xml:space="preserve">显示和串口均保留 1 位小数。允许使用整数定点运算，推荐将结果保存为 </w:t>
+        <w:t xml:space="preserve">显示和串口均保留 1 位小数。可以使用整数定点运算，例如把结果保存为 </w:t>
       </w:r>
       <w:r>
         <w:rPr>
@@ -1465,7 +1465,7 @@
           <w:color w:val="000000"/>
           <w:sz w:val="22"/>
         </w:rPr>
-        <w:t>，避免使用浮点格式化造成额外依赖。换算结果必须来自当前电路中的 AO 电压，不能写死为默认值。</w:t>
+        <w:t>，这样不依赖浮点格式化。换算结果必须来自当前电路的 AO 电压，不能写成默认值。</w:t>
       </w:r>
     </w:p>
     <w:p>
@@ -1486,7 +1486,7 @@
           <w:color w:val="000000"/>
           <w:sz w:val="22"/>
         </w:rPr>
-        <w:t>采集态 OLED 只显示以下四行信息，示例格式如下：</w:t>
+        <w:t>采集态 OLED 显示四行信息，格式如下：</w:t>
       </w:r>
     </w:p>
     <w:p>
@@ -1544,7 +1544,7 @@
           <w:color w:val="000000"/>
           <w:sz w:val="22"/>
         </w:rPr>
-        <w:t>其中两路数值随仿真中的 ADC 采集源实时变化。OLED 可显示标题和接口速率，但不得显示 ADC raw 数值、仿真器状态、I²C 地址或其他会遮挡数据的调试信息。</w:t>
+        <w:t>两路数值应随仿真中的 ADC 采集源变化。标题和接口速率可以保留，但屏幕上不能出现 ADC raw 数值、仿真器状态、I²C 地址或会遮挡数据的调试信息。</w:t>
       </w:r>
     </w:p>
     <w:p>
@@ -1557,7 +1557,7 @@
           <w:color w:val="000000"/>
           <w:sz w:val="22"/>
         </w:rPr>
-        <w:t>待机态 OLED 显示居中的：</w:t>
+        <w:t>待机时，OLED 居中显示：</w:t>
       </w:r>
     </w:p>
     <w:p>
@@ -1648,7 +1648,7 @@
           <w:color w:val="000000"/>
           <w:sz w:val="22"/>
         </w:rPr>
-        <w:t>程序应持续运行，不得因一次 ADC 超时、无效输入或显示刷新失败而输出虚假的“正常采集”状态。不得在循环中创建无界增长的缓冲区；串口与 OLED 缓冲区长度应明确且足够覆盖规定格式。</w:t>
+        <w:t>程序需要持续运行。单次 ADC 超时、无效输入或显示刷新失败时，不能输出虚假的“正常采集”状态；循环中也不能创建无界增长的缓冲区。串口和 OLED 缓冲区应有明确长度，并能容纳规定格式。</w:t>
       </w:r>
     </w:p>
     <w:p>
@@ -1669,7 +1669,7 @@
           <w:color w:val="000000"/>
           <w:sz w:val="22"/>
         </w:rPr>
-        <w:t>评测人员在不修改 IOC 和电路连接的情况下，至少执行以下场景：</w:t>
+        <w:t>验收时不修改 IOC 和电路连接，执行以下场景：</w:t>
       </w:r>
     </w:p>
     <w:tbl>
@@ -2210,7 +2210,7 @@
           <w:color w:val="000000"/>
           <w:sz w:val="22"/>
         </w:rPr>
-        <w:t>在 3.3 V 参考下，1 个 12 bit ADC 量化步进约为 0.806 mV。显示值按题面要求保留一位小数，判定时以实际采样量化后的结果为准。</w:t>
+        <w:t>在 3.3 V 参考下，1 个 12 bit ADC 量化步进约为 0.806 mV。显示值保留一位小数，评定时以实际采样量化后的结果为准。</w:t>
       </w:r>
     </w:p>
     <w:p>
@@ -3012,7 +3012,7 @@
           <w:color w:val="000000"/>
           <w:sz w:val="21"/>
         </w:rPr>
-        <w:t xml:space="preserve"> 入口和正常的 HAL 初始化流程；禁止用死循环、固定延时截图或静态字符串替代外设行为。</w:t>
+        <w:t xml:space="preserve"> 入口和正常的 HAL 初始化流程；不能用死循环、固定字符串或截图代替外设行为。</w:t>
       </w:r>
     </w:p>
     <w:p>
@@ -3173,7 +3173,7 @@
           <w:color w:val="000000"/>
           <w:sz w:val="22"/>
         </w:rPr>
-        <w:t>提交一个可导入 AliceSIM 的工程文件夹，至少包含：</w:t>
+        <w:t>提交一个可导入 AliceSIM 的工程文件夹，内容包括：</w:t>
       </w:r>
     </w:p>
     <w:p>
@@ -3358,7 +3358,7 @@
           <w:color w:val="000000"/>
           <w:sz w:val="22"/>
         </w:rPr>
-        <w:t>。提交前请在 AliceSIM 中重新导入该文件夹，执行一次构建、运行和复位，确认没有依赖本机绝对路径或未提交的文件。</w:t>
+        <w:t>。提交前在 AliceSIM 中重新导入该文件夹，执行一次构建、运行和复位，确认工程不依赖本机绝对路径，也没有遗漏文件。</w:t>
       </w:r>
     </w:p>
     <w:p>
@@ -3380,7 +3380,7 @@
           <w:color w:val="000000"/>
           <w:sz w:val="21"/>
         </w:rPr>
-        <w:t>打开工程文件夹，确认 IOC、源码和电路文件自动关联。</w:t>
+        <w:t>打开工程文件夹，确认 IOC、源码和电路文件已经关联。</w:t>
       </w:r>
     </w:p>
     <w:p>
@@ -3394,7 +3394,7 @@
           <w:color w:val="000000"/>
           <w:sz w:val="21"/>
         </w:rPr>
-        <w:t>执行构建，检查 Clang 诊断、HAL 模型和外设连接均通过。</w:t>
+        <w:t>执行构建，检查 Clang 诊断、HAL 模型和外设连接。</w:t>
       </w:r>
     </w:p>
     <w:p>
@@ -3408,7 +3408,7 @@
           <w:color w:val="000000"/>
           <w:sz w:val="21"/>
         </w:rPr>
-        <w:t xml:space="preserve">进入仿真页，先观察 OFF 状态，再切换 </w:t>
+        <w:t xml:space="preserve">进入仿真页，观察 OFF 状态，再把 </w:t>
       </w:r>
       <w:r>
         <w:rPr>
@@ -3424,7 +3424,7 @@
           <w:color w:val="000000"/>
           <w:sz w:val="21"/>
         </w:rPr>
-        <w:t xml:space="preserve"> 至 ON。</w:t>
+        <w:t xml:space="preserve"> 切到 ON。</w:t>
       </w:r>
     </w:p>
     <w:p>
@@ -3452,7 +3452,7 @@
           <w:color w:val="000000"/>
           <w:sz w:val="21"/>
         </w:rPr>
-        <w:t>打开逻辑分析仪或串口面板检查周期、格式和状态切换；需要评估 DMA 加分时，检查运行摘要中的 DMA 传输记录。</w:t>
+        <w:t>用逻辑分析仪或串口面板检查周期、格式和状态切换；评估 DMA 加分时，再查看运行摘要中的 DMA 传输记录。</w:t>
       </w:r>
     </w:p>
     <w:p>
@@ -3482,7 +3482,7 @@
           <w:color w:val="000000"/>
           <w:sz w:val="21"/>
         </w:rPr>
-        <w:t>、红灯和无周期发送三项同时成立。</w:t>
+        <w:t>、红灯和停止周期发送同时成立。</w:t>
       </w:r>
     </w:p>
     <w:p>
@@ -3495,7 +3495,7 @@
           <w:color w:val="000000"/>
           <w:sz w:val="22"/>
         </w:rPr>
-        <w:t>本题的参考电路已经按“MCU—显示—模拟输入—状态指示—开关”分区重新排布，元件标签和导线均可在电路页中按需隐藏或调整，不影响网络连接和评分规则。</w:t>
+        <w:t>配套电路按“MCU—显示—模拟输入—状态指示—开关”分区排布。电路页支持隐藏元件标签，也可以调整视图和导线拐点，不影响网络连接和评分规则。</w:t>
       </w:r>
     </w:p>
     <w:sectPr>

</xml_diff>